<commit_message>
Laatste stap: inleveren pas na de zelftest, met een codewoord in het werkdocument
Zoals MWW les 3 (Jonas, 15-10-2026: "wel in alles wat er na komt"). Het werkdocument begint
het laatste deel met het vak voor het codewoord.

Co-Authored-By: Claude Opus 5.5 <noreply@anthropic.com>
</commit_message>
<xml_diff>
--- a/werkdocument/WP3_Een-veilig-account.docx
+++ b/werkdocument/WP3_Een-veilig-account.docx
@@ -2113,6 +2113,63 @@
         </w:rPr>
         <w:t>Nalezen</w:t>
       </w:r>
+    </w:p>
+    <w:p>
+      <w:pPr>
+        <w:keepNext/>
+        <w:spacing w:before="160" w:after="80"/>
+      </w:pPr>
+      <w:r>
+        <w:rPr>
+          <w:b/>
+        </w:rPr>
+        <w:t>Het codewoord van de zelftest (stap 5 op de lespagina):</w:t>
+      </w:r>
+    </w:p>
+    <w:tbl>
+      <w:tblPr>
+        <w:tblW w:type="auto" w:w="0"/>
+        <w:jc w:val="center"/>
+        <w:tblLayout w:type="fixed"/>
+        <w:tblLook w:firstColumn="1" w:firstRow="1" w:lastColumn="0" w:lastRow="0" w:noHBand="0" w:noVBand="1" w:val="04A0"/>
+        <w:tblBorders>
+          <w:top w:val="single" w:sz="6" w:space="0" w:color="A7B1DE"/>
+          <w:left w:val="single" w:sz="6" w:space="0" w:color="A7B1DE"/>
+          <w:bottom w:val="single" w:sz="6" w:space="0" w:color="A7B1DE"/>
+          <w:right w:val="single" w:sz="6" w:space="0" w:color="A7B1DE"/>
+          <w:insideH w:val="nil"/>
+          <w:insideV w:val="nil"/>
+        </w:tblBorders>
+        <w:tblLayout w:type="fixed"/>
+      </w:tblPr>
+      <w:tblGrid>
+        <w:gridCol w:w="9638"/>
+      </w:tblGrid>
+      <w:tr>
+        <w:trPr>
+          <w:trHeight w:val="510" w:hRule="atLeast"/>
+          <w:cantSplit/>
+        </w:trPr>
+        <w:tc>
+          <w:tcPr>
+            <w:tcW w:type="dxa" w:w="9638"/>
+            <w:shd w:val="clear" w:color="auto" w:fill="F3F5FC"/>
+          </w:tcPr>
+          <w:p>
+            <w:pPr>
+              <w:spacing w:before="0" w:after="0"/>
+            </w:pPr>
+          </w:p>
+        </w:tc>
+      </w:tr>
+    </w:tbl>
+    <w:p>
+      <w:pPr>
+        <w:spacing w:before="0" w:after="0" w:line="80" w:lineRule="exact"/>
+        <w:rPr>
+          <w:sz w:val="4"/>
+        </w:rPr>
+      </w:pPr>
     </w:p>
     <w:tbl>
       <w:tblPr>

</xml_diff>